<commit_message>
Update paper: replace 'pending' with published GitHub URL
- Code and Data Availability section now points to
  https://github.com/mleyvaz/neutrosophic-affine (live)
- Abstract updated with direct repo link + MIT License reference
- Expanded Code Availability to list repository contents explicitly
</commit_message>
<xml_diff>
--- a/paper/Paper_V2_Neutrosophic_vs_Affine.docx
+++ b/paper/Paper_V2_Neutrosophic_vs_Affine.docx
@@ -70,7 +70,7 @@
           <w:b w:val="0"/>
           <w:i w:val="0"/>
         </w:rPr>
-        <w:t>Uncertainty representation in applied mathematics has evolved through classical interval arithmetic, affine arithmetic, and neutrosophic theory, yet no systematic comparison exists between neutrosophic interval-indeterminate numbers a + bI and affine arithmetic, despite their parallel development since 1993. We formalize this comparison in one dimension with a proof of range equivalence (Theorem 1), propose a multi-source neutrosophic extension (MSNN) that achieves N-dimensional parity with affine arithmetic while preserving the semantic transparency of the a + bI notation (Theorem 2), and further extend to hesitant indeterminacy for expert-disagreement modeling. A computational benchmark of fifteen algebraic expressions is provided with runtime, range-width, and overestimation percentages. Theorem 1 establishes that neutrosophic a + bI and affine arithmetic produce identical ranges for every algebraic expression in a single variable under the bijection I = (1+ε)/2. Theorem 2 extends the equivalence to N independent sources through the multi-source construction. The hesitant extension N_H = a + b · H(I) captures epistemic states produced by expert disagreement that neither interval arithmetic nor native affine arithmetic can represent. We conclude that neutrosophic and affine arithmetic occupy complementary positions: affine for engineering precision with multi-source tracking, neutrosophic for semantic transparency, broader qualitative scope, and natural hesitant-evidence consolidation. A reference implementation is released as open-source code.</w:t>
+        <w:t>Uncertainty representation in applied mathematics has evolved through classical interval arithmetic, affine arithmetic, and neutrosophic theory, yet no systematic comparison exists between neutrosophic interval-indeterminate numbers a + bI and affine arithmetic, despite their parallel development since 1993. We formalize this comparison in one dimension with a proof of range equivalence (Theorem 1), propose a multi-source neutrosophic extension (MSNN) that achieves N-dimensional parity with affine arithmetic while preserving the semantic transparency of the a + bI notation (Theorem 2), and further extend to hesitant indeterminacy for expert-disagreement modeling. A computational benchmark of fifteen algebraic expressions is provided with runtime, range-width, and overestimation percentages. Theorem 1 establishes that neutrosophic a + bI and affine arithmetic produce identical ranges for every algebraic expression in a single variable under the bijection I = (1+ε)/2. Theorem 2 extends the equivalence to N independent sources through the multi-source construction. The hesitant extension N_H = a + b · H(I) captures epistemic states produced by expert disagreement that neither interval arithmetic nor native affine arithmetic can represent. We conclude that neutrosophic and affine arithmetic occupy complementary positions: affine for engineering precision with multi-source tracking, neutrosophic for semantic transparency, broader qualitative scope, and natural hesitant-evidence consolidation. A reference Python implementation is released under MIT License at https://github.com/mleyvaz/neutrosophic-affine, enabling full reproduction of all theorems, examples, benchmarks, and figures in this paper.</w:t>
       </w:r>
     </w:p>
     <w:p>
@@ -1697,7 +1697,28 @@
           <w:b w:val="0"/>
           <w:i w:val="0"/>
         </w:rPr>
-        <w:t>A Python reference implementation of all four formalisms (interval, affine, classical neutrosophic, MSNN), together with the fifteen-expression benchmark and figure generation scripts, is released as open-source code. Repository: https://github.com/mleyvaz/neutrosophic-affine (pending). Archived version: Zenodo DOI (pending publication).</w:t>
+        <w:t>A Python reference implementation of all four formalisms (interval, affine, classical neutrosophic, MSNN) together with the hesitant extension, the fifteen-expression benchmark, and figure-generation scripts is released as open-source code under the MIT License at:</w:t>
+      </w:r>
+    </w:p>
+    <w:p>
+      <w:pPr>
+        <w:ind w:left="680"/>
+      </w:pPr>
+      <w:r>
+        <w:rPr>
+          <w:b/>
+          <w:sz w:val="22"/>
+        </w:rPr>
+        <w:t>https://github.com/mleyvaz/neutrosophic-affine</w:t>
+      </w:r>
+    </w:p>
+    <w:p>
+      <w:r>
+        <w:rPr>
+          <w:b w:val="0"/>
+          <w:i w:val="0"/>
+        </w:rPr>
+        <w:t>The repository includes: (i) five Python modules — interval.py, affine.py, neutrosophic.py, msnn.py, hesitant.py; (ii) a sanity-test suite verifying Theorems 1 and 2 empirically on ten representative expressions; (iii) the benchmark script bench_all.py producing bench_results.csv for fifteen algebraic expressions; (iv) four figure-generation scripts corresponding to Figures 1–4; and (v) a regeneration script for this paper. All results reported in Sections 3, 4, 5 and 6 can be reproduced by running the scripts in order documented in the repository README. A permanent archival DOI will be issued via Zenodo upon acceptance.</w:t>
       </w:r>
     </w:p>
     <w:p>

</xml_diff>